<commit_message>
Add system documentation updates and backend maintenance/audit scripts.
Include regenerated architecture docs, Chapter IV docx copy, and database audit/repair probe scripts used during development.

Co-authored-by: Cursor <cursoragent@cursor.com>
</commit_message>
<xml_diff>
--- a/docs/SYSTEM_ARCHITECTURE.docx
+++ b/docs/SYSTEM_ARCHITECTURE.docx
@@ -15,7 +15,7 @@
           <w:sz w:val="40"/>
           <w:szCs w:val="40"/>
         </w:rPr>
-        <w:t xml:space="preserve">JUST RMS — System Architecture (Current)</w:t>
+        <w:t xml:space="preserve">JUST RMS — Complete System Architecture</w:t>
       </w:r>
     </w:p>
     <w:p>
@@ -31,7 +31,7 @@
           <w:sz w:val="22"/>
           <w:szCs w:val="22"/>
         </w:rPr>
-        <w:t xml:space="preserve">Based on the running MERN application — July 2026 codebase</w:t>
+        <w:t xml:space="preserve">Full current system (not a draft) — MERN codebase</w:t>
       </w:r>
     </w:p>
     <w:p>
@@ -44,7 +44,19 @@
     </w:p>
     <w:p>
       <w:pPr>
-        <w:spacing w:after="120" w:before="260"/>
+        <w:spacing w:after="100"/>
+      </w:pPr>
+      <w:r>
+        <w:rPr>
+          <w:sz w:val="22"/>
+          <w:szCs w:val="22"/>
+        </w:rPr>
+        <w:t xml:space="preserve">This document describes the whole Jamhuriya Research Management System as implemented: portals, layers, modules, pages, roles, and the proposal-to-project lifecycle.</w:t>
+      </w:r>
+    </w:p>
+    <w:p>
+      <w:pPr>
+        <w:spacing w:after="120" w:before="280"/>
       </w:pPr>
       <w:r>
         <w:rPr>
@@ -54,7 +66,7 @@
           <w:sz w:val="26"/>
           <w:szCs w:val="26"/>
         </w:rPr>
-        <w:t xml:space="preserve">1. Architecture diagram (current)</w:t>
+        <w:t xml:space="preserve">1. System purpose</w:t>
       </w:r>
     </w:p>
     <w:p>
@@ -66,7 +78,61 @@
           <w:sz w:val="22"/>
           <w:szCs w:val="22"/>
         </w:rPr>
-        <w:t xml:space="preserve">Three layers: React/Vite SPA, Express REST API with JWT and X-Program-Tier, MongoDB. Shared staff pick Undergraduate or Postgraduate portal after login.</w:t>
+        <w:t xml:space="preserve">JUST RMS manages university research end-to-end: proposals, ethics (JUREC), peer/committee/finance review, projects, funding calls, grants, budgets, payments, publications, repository, groups, thesis supervision, analytics, notifications, policies, and audit.</w:t>
+      </w:r>
+    </w:p>
+    <w:p>
+      <w:pPr>
+        <w:spacing w:after="70"/>
+        <w:ind w:left="280"/>
+      </w:pPr>
+      <w:r>
+        <w:rPr>
+          <w:sz w:val="22"/>
+          <w:szCs w:val="22"/>
+        </w:rPr>
+        <w:t xml:space="preserve">• Two portals share one app and one database: Undergraduate (UG) and Postgraduate (PG).</w:t>
+      </w:r>
+    </w:p>
+    <w:p>
+      <w:pPr>
+        <w:spacing w:after="70"/>
+        <w:ind w:left="280"/>
+      </w:pPr>
+      <w:r>
+        <w:rPr>
+          <w:sz w:val="22"/>
+          <w:szCs w:val="22"/>
+        </w:rPr>
+        <w:t xml:space="preserve">• Shared staff pick portal after login (X-Program-Tier). Researchers are locked to their programTier.</w:t>
+      </w:r>
+    </w:p>
+    <w:p>
+      <w:pPr>
+        <w:spacing w:after="70"/>
+        <w:ind w:left="280"/>
+      </w:pPr>
+      <w:r>
+        <w:rPr>
+          <w:sz w:val="22"/>
+          <w:szCs w:val="22"/>
+        </w:rPr>
+        <w:t xml:space="preserve">• After login every role opens Dashboard (/dashboard).</w:t>
+      </w:r>
+    </w:p>
+    <w:p>
+      <w:pPr>
+        <w:spacing w:after="120" w:before="280"/>
+      </w:pPr>
+      <w:r>
+        <w:rPr>
+          <w:b/>
+          <w:bCs/>
+          <w:color w:val="0C4A6E"/>
+          <w:sz w:val="26"/>
+          <w:szCs w:val="26"/>
+        </w:rPr>
+        <w:t xml:space="preserve">2. Architecture diagram</w:t>
       </w:r>
     </w:p>
     <w:p>
@@ -128,12 +194,12 @@
           <w:sz w:val="18"/>
           <w:szCs w:val="18"/>
         </w:rPr>
-        <w:t xml:space="preserve">Figure 1. Current JUST RMS layered architecture</w:t>
-      </w:r>
-    </w:p>
-    <w:p>
-      <w:pPr>
-        <w:spacing w:after="120" w:before="260"/>
+        <w:t xml:space="preserve">Figure 1. Current layered architecture (Frontend / API / MongoDB)</w:t>
+      </w:r>
+    </w:p>
+    <w:p>
+      <w:pPr>
+        <w:spacing w:after="120" w:before="280"/>
       </w:pPr>
       <w:r>
         <w:rPr>
@@ -143,64 +209,174 @@
           <w:sz w:val="26"/>
           <w:szCs w:val="26"/>
         </w:rPr>
-        <w:t xml:space="preserve">2. Technology stack (as built)</w:t>
-      </w:r>
-    </w:p>
-    <w:p>
-      <w:pPr>
-        <w:spacing w:after="70"/>
-        <w:ind w:left="280"/>
-      </w:pPr>
-      <w:r>
-        <w:rPr>
-          <w:sz w:val="22"/>
-          <w:szCs w:val="22"/>
-        </w:rPr>
-        <w:t xml:space="preserve">• Frontend: React + Vite + React Router + Axios + Recharts</w:t>
-      </w:r>
-    </w:p>
-    <w:p>
-      <w:pPr>
-        <w:spacing w:after="70"/>
-        <w:ind w:left="280"/>
-      </w:pPr>
-      <w:r>
-        <w:rPr>
-          <w:sz w:val="22"/>
-          <w:szCs w:val="22"/>
-        </w:rPr>
-        <w:t xml:space="preserve">• Backend: Node.js + Express + Mongoose + JWT + bcrypt + Multer</w:t>
-      </w:r>
-    </w:p>
-    <w:p>
-      <w:pPr>
-        <w:spacing w:after="70"/>
-        <w:ind w:left="280"/>
-      </w:pPr>
-      <w:r>
-        <w:rPr>
-          <w:sz w:val="22"/>
-          <w:szCs w:val="22"/>
-        </w:rPr>
-        <w:t xml:space="preserve">• Database: MongoDB</w:t>
-      </w:r>
-    </w:p>
-    <w:p>
-      <w:pPr>
-        <w:spacing w:after="70"/>
-        <w:ind w:left="280"/>
-      </w:pPr>
-      <w:r>
-        <w:rPr>
-          <w:sz w:val="22"/>
-          <w:szCs w:val="22"/>
-        </w:rPr>
-        <w:t xml:space="preserve">• Portals: undergraduate | postgraduate (header X-Program-Tier for shared staff)</w:t>
-      </w:r>
-    </w:p>
-    <w:p>
-      <w:pPr>
-        <w:spacing w:after="120" w:before="260"/>
+        <w:t xml:space="preserve">3. Technology stack</w:t>
+      </w:r>
+    </w:p>
+    <w:p>
+      <w:pPr>
+        <w:spacing w:after="90" w:before="180"/>
+      </w:pPr>
+      <w:r>
+        <w:rPr>
+          <w:b/>
+          <w:bCs/>
+          <w:color w:val="0369A1"/>
+          <w:sz w:val="24"/>
+          <w:szCs w:val="24"/>
+        </w:rPr>
+        <w:t xml:space="preserve">3.1 Frontend</w:t>
+      </w:r>
+    </w:p>
+    <w:p>
+      <w:pPr>
+        <w:spacing w:after="70"/>
+        <w:ind w:left="280"/>
+      </w:pPr>
+      <w:r>
+        <w:rPr>
+          <w:sz w:val="22"/>
+          <w:szCs w:val="22"/>
+        </w:rPr>
+        <w:t xml:space="preserve">• React + Vite + React Router + Axios + Recharts</w:t>
+      </w:r>
+    </w:p>
+    <w:p>
+      <w:pPr>
+        <w:spacing w:after="70"/>
+        <w:ind w:left="280"/>
+      </w:pPr>
+      <w:r>
+        <w:rPr>
+          <w:sz w:val="22"/>
+          <w:szCs w:val="22"/>
+        </w:rPr>
+        <w:t xml:space="preserve">• Auth JWT in client; staff send header X-Program-Tier</w:t>
+      </w:r>
+    </w:p>
+    <w:p>
+      <w:pPr>
+        <w:spacing w:after="70"/>
+        <w:ind w:left="280"/>
+      </w:pPr>
+      <w:r>
+        <w:rPr>
+          <w:sz w:val="22"/>
+          <w:szCs w:val="22"/>
+        </w:rPr>
+        <w:t xml:space="preserve">• Dev URL: http://localhost:5173 (proxies /api to backend)</w:t>
+      </w:r>
+    </w:p>
+    <w:p>
+      <w:pPr>
+        <w:spacing w:after="90" w:before="180"/>
+      </w:pPr>
+      <w:r>
+        <w:rPr>
+          <w:b/>
+          <w:bCs/>
+          <w:color w:val="0369A1"/>
+          <w:sz w:val="24"/>
+          <w:szCs w:val="24"/>
+        </w:rPr>
+        <w:t xml:space="preserve">3.2 Backend</w:t>
+      </w:r>
+    </w:p>
+    <w:p>
+      <w:pPr>
+        <w:spacing w:after="70"/>
+        <w:ind w:left="280"/>
+      </w:pPr>
+      <w:r>
+        <w:rPr>
+          <w:sz w:val="22"/>
+          <w:szCs w:val="22"/>
+        </w:rPr>
+        <w:t xml:space="preserve">• Node.js + Express REST API under /api/...</w:t>
+      </w:r>
+    </w:p>
+    <w:p>
+      <w:pPr>
+        <w:spacing w:after="70"/>
+        <w:ind w:left="280"/>
+      </w:pPr>
+      <w:r>
+        <w:rPr>
+          <w:sz w:val="22"/>
+          <w:szCs w:val="22"/>
+        </w:rPr>
+        <w:t xml:space="preserve">• JWT access token + refresh token on User; bcrypt passwords</w:t>
+      </w:r>
+    </w:p>
+    <w:p>
+      <w:pPr>
+        <w:spacing w:after="70"/>
+        <w:ind w:left="280"/>
+      </w:pPr>
+      <w:r>
+        <w:rPr>
+          <w:sz w:val="22"/>
+          <w:szCs w:val="22"/>
+        </w:rPr>
+        <w:t xml:space="preserve">• Multer uploads; PDF certificate generation for ethics</w:t>
+      </w:r>
+    </w:p>
+    <w:p>
+      <w:pPr>
+        <w:spacing w:after="70"/>
+        <w:ind w:left="280"/>
+      </w:pPr>
+      <w:r>
+        <w:rPr>
+          <w:sz w:val="22"/>
+          <w:szCs w:val="22"/>
+        </w:rPr>
+        <w:t xml:space="preserve">• Middleware: authenticateUser, requireActiveUser, authorizeRoles, programTier scope</w:t>
+      </w:r>
+    </w:p>
+    <w:p>
+      <w:pPr>
+        <w:spacing w:after="70"/>
+        <w:ind w:left="280"/>
+      </w:pPr>
+      <w:r>
+        <w:rPr>
+          <w:sz w:val="22"/>
+          <w:szCs w:val="22"/>
+        </w:rPr>
+        <w:t xml:space="preserve">• Dev URL: http://localhost:5000</w:t>
+      </w:r>
+    </w:p>
+    <w:p>
+      <w:pPr>
+        <w:spacing w:after="90" w:before="180"/>
+      </w:pPr>
+      <w:r>
+        <w:rPr>
+          <w:b/>
+          <w:bCs/>
+          <w:color w:val="0369A1"/>
+          <w:sz w:val="24"/>
+          <w:szCs w:val="24"/>
+        </w:rPr>
+        <w:t xml:space="preserve">3.3 Database</w:t>
+      </w:r>
+    </w:p>
+    <w:p>
+      <w:pPr>
+        <w:spacing w:after="70"/>
+        <w:ind w:left="280"/>
+      </w:pPr>
+      <w:r>
+        <w:rPr>
+          <w:sz w:val="22"/>
+          <w:szCs w:val="22"/>
+        </w:rPr>
+        <w:t xml:space="preserve">• MongoDB via Mongoose — see DATABASE_STRUCTURE.docx for full schema</w:t>
+      </w:r>
+    </w:p>
+    <w:p>
+      <w:pPr>
+        <w:spacing w:after="120" w:before="280"/>
       </w:pPr>
       <w:r>
         <w:rPr>
@@ -210,19 +386,7 @@
           <w:sz w:val="26"/>
           <w:szCs w:val="26"/>
         </w:rPr>
-        <w:t xml:space="preserve">3. Current proposal review flow</w:t>
-      </w:r>
-    </w:p>
-    <w:p>
-      <w:pPr>
-        <w:spacing w:after="100"/>
-      </w:pPr>
-      <w:r>
-        <w:rPr>
-          <w:sz w:val="22"/>
-          <w:szCs w:val="22"/>
-        </w:rPr>
-        <w:t xml:space="preserve">Assign-first Phase 3: Director assigns Leadership for peer review, then Faculty Coordinator for committee, then Finance for grant proposals only. Final Approve creates a Project. Voluntary proposals skip finance. Ethics (JUREC) is separate from faculty committee.</w:t>
+        <w:t xml:space="preserve">4. Proposal review flow (Phase 3) — whole path</w:t>
       </w:r>
     </w:p>
     <w:p>
@@ -284,12 +448,155 @@
           <w:sz w:val="18"/>
           <w:szCs w:val="18"/>
         </w:rPr>
-        <w:t xml:space="preserve">Figure 2. Current proposal multi-stage review flow</w:t>
-      </w:r>
-    </w:p>
-    <w:p>
-      <w:pPr>
-        <w:spacing w:after="120" w:before="260"/>
+        <w:t xml:space="preserve">Figure 2. Current multi-stage proposal review</w:t>
+      </w:r>
+    </w:p>
+    <w:p>
+      <w:pPr>
+        <w:spacing w:after="70"/>
+        <w:ind w:left="280"/>
+      </w:pPr>
+      <w:r>
+        <w:rPr>
+          <w:sz w:val="22"/>
+          <w:szCs w:val="22"/>
+        </w:rPr>
+        <w:t xml:space="preserve">• 1. Researcher submits Voluntary or Grant fund call proposal (+ ethics when required)</w:t>
+      </w:r>
+    </w:p>
+    <w:p>
+      <w:pPr>
+        <w:spacing w:after="70"/>
+        <w:ind w:left="280"/>
+      </w:pPr>
+      <w:r>
+        <w:rPr>
+          <w:sz w:val="22"/>
+          <w:szCs w:val="22"/>
+        </w:rPr>
+        <w:t xml:space="preserve">• 2. Director: Assign &amp; send to reviewer (Leadership)</w:t>
+      </w:r>
+    </w:p>
+    <w:p>
+      <w:pPr>
+        <w:spacing w:after="70"/>
+        <w:ind w:left="280"/>
+      </w:pPr>
+      <w:r>
+        <w:rPr>
+          <w:sz w:val="22"/>
+          <w:szCs w:val="22"/>
+        </w:rPr>
+        <w:t xml:space="preserve">• 3. Leadership: peer score 1–5 + comment</w:t>
+      </w:r>
+    </w:p>
+    <w:p>
+      <w:pPr>
+        <w:spacing w:after="70"/>
+        <w:ind w:left="280"/>
+      </w:pPr>
+      <w:r>
+        <w:rPr>
+          <w:sz w:val="22"/>
+          <w:szCs w:val="22"/>
+        </w:rPr>
+        <w:t xml:space="preserve">• 4. Director: Complete peer stage when all assignees submitted</w:t>
+      </w:r>
+    </w:p>
+    <w:p>
+      <w:pPr>
+        <w:spacing w:after="70"/>
+        <w:ind w:left="280"/>
+      </w:pPr>
+      <w:r>
+        <w:rPr>
+          <w:sz w:val="22"/>
+          <w:szCs w:val="22"/>
+        </w:rPr>
+        <w:t xml:space="preserve">• 5. Director: Assign &amp; send to committee (Faculty Coordinators)</w:t>
+      </w:r>
+    </w:p>
+    <w:p>
+      <w:pPr>
+        <w:spacing w:after="70"/>
+        <w:ind w:left="280"/>
+      </w:pPr>
+      <w:r>
+        <w:rPr>
+          <w:sz w:val="22"/>
+          <w:szCs w:val="22"/>
+        </w:rPr>
+        <w:t xml:space="preserve">• 6. Assigned Coordinator: committee recommend/reject/revision</w:t>
+      </w:r>
+    </w:p>
+    <w:p>
+      <w:pPr>
+        <w:spacing w:after="70"/>
+        <w:ind w:left="280"/>
+      </w:pPr>
+      <w:r>
+        <w:rPr>
+          <w:sz w:val="22"/>
+          <w:szCs w:val="22"/>
+        </w:rPr>
+        <w:t xml:space="preserve">• 7. Grant only — Director: Assign &amp; send to finance</w:t>
+      </w:r>
+    </w:p>
+    <w:p>
+      <w:pPr>
+        <w:spacing w:after="70"/>
+        <w:ind w:left="280"/>
+      </w:pPr>
+      <w:r>
+        <w:rPr>
+          <w:sz w:val="22"/>
+          <w:szCs w:val="22"/>
+        </w:rPr>
+        <w:t xml:space="preserve">• 8. Grant only — Assigned Finance: approve/reject at /finance/reviews</w:t>
+      </w:r>
+    </w:p>
+    <w:p>
+      <w:pPr>
+        <w:spacing w:after="70"/>
+        <w:ind w:left="280"/>
+      </w:pPr>
+      <w:r>
+        <w:rPr>
+          <w:sz w:val="22"/>
+          <w:szCs w:val="22"/>
+        </w:rPr>
+        <w:t xml:space="preserve">• 9. When stage = ready_for_director — Director Proposal decision → Approve creates Project</w:t>
+      </w:r>
+    </w:p>
+    <w:p>
+      <w:pPr>
+        <w:spacing w:after="70"/>
+        <w:ind w:left="280"/>
+      </w:pPr>
+      <w:r>
+        <w:rPr>
+          <w:sz w:val="22"/>
+          <w:szCs w:val="22"/>
+        </w:rPr>
+        <w:t xml:space="preserve">• Voluntary: finance stage skipped. Ethics certificate does NOT auto-pass committee.</w:t>
+      </w:r>
+    </w:p>
+    <w:p>
+      <w:pPr>
+        <w:spacing w:after="70"/>
+        <w:ind w:left="280"/>
+      </w:pPr>
+      <w:r>
+        <w:rPr>
+          <w:sz w:val="22"/>
+          <w:szCs w:val="22"/>
+        </w:rPr>
+        <w:t xml:space="preserve">• List chips: Sent to reviewer | Sent to committee | Sent to finance</w:t>
+      </w:r>
+    </w:p>
+    <w:p>
+      <w:pPr>
+        <w:spacing w:after="120" w:before="280"/>
       </w:pPr>
       <w:r>
         <w:rPr>
@@ -299,77 +606,345 @@
           <w:sz w:val="26"/>
           <w:szCs w:val="26"/>
         </w:rPr>
-        <w:t xml:space="preserve">4. Active roles (seed)</w:t>
-      </w:r>
-    </w:p>
-    <w:p>
-      <w:pPr>
-        <w:spacing w:after="70"/>
-        <w:ind w:left="280"/>
-      </w:pPr>
-      <w:r>
-        <w:rPr>
-          <w:sz w:val="22"/>
-          <w:szCs w:val="22"/>
-        </w:rPr>
-        <w:t xml:space="preserve">• research_director — director@rms.edu</w:t>
-      </w:r>
-    </w:p>
-    <w:p>
-      <w:pPr>
-        <w:spacing w:after="70"/>
-        <w:ind w:left="280"/>
-      </w:pPr>
-      <w:r>
-        <w:rPr>
-          <w:sz w:val="22"/>
-          <w:szCs w:val="22"/>
-        </w:rPr>
-        <w:t xml:space="preserve">• faculty_coordinator — coordinator@rms.edu</w:t>
-      </w:r>
-    </w:p>
-    <w:p>
-      <w:pPr>
-        <w:spacing w:after="70"/>
-        <w:ind w:left="280"/>
-      </w:pPr>
-      <w:r>
-        <w:rPr>
-          <w:sz w:val="22"/>
-          <w:szCs w:val="22"/>
-        </w:rPr>
-        <w:t xml:space="preserve">• leadership — leadership@rms.edu (peer review)</w:t>
-      </w:r>
-    </w:p>
-    <w:p>
-      <w:pPr>
-        <w:spacing w:after="70"/>
-        <w:ind w:left="280"/>
-      </w:pPr>
-      <w:r>
-        <w:rPr>
-          <w:sz w:val="22"/>
-          <w:szCs w:val="22"/>
-        </w:rPr>
-        <w:t xml:space="preserve">• finance_officer — finance@rms.edu</w:t>
-      </w:r>
-    </w:p>
-    <w:p>
-      <w:pPr>
-        <w:spacing w:after="70"/>
-        <w:ind w:left="280"/>
-      </w:pPr>
-      <w:r>
-        <w:rPr>
-          <w:sz w:val="22"/>
-          <w:szCs w:val="22"/>
-        </w:rPr>
-        <w:t xml:space="preserve">• researcher — asha@rms.edu (UG), mahad@rms.edu (PG)</w:t>
-      </w:r>
-    </w:p>
-    <w:p>
-      <w:pPr>
-        <w:spacing w:after="120" w:before="260"/>
+        <w:t xml:space="preserve">5. Complete module map (UI routes)</w:t>
+      </w:r>
+    </w:p>
+    <w:p>
+      <w:pPr>
+        <w:spacing w:after="90" w:before="180"/>
+      </w:pPr>
+      <w:r>
+        <w:rPr>
+          <w:b/>
+          <w:bCs/>
+          <w:color w:val="0369A1"/>
+          <w:sz w:val="24"/>
+          <w:szCs w:val="24"/>
+        </w:rPr>
+        <w:t xml:space="preserve">5.1 All authenticated users</w:t>
+      </w:r>
+    </w:p>
+    <w:p>
+      <w:pPr>
+        <w:spacing w:after="70"/>
+        <w:ind w:left="280"/>
+      </w:pPr>
+      <w:r>
+        <w:rPr>
+          <w:sz w:val="22"/>
+          <w:szCs w:val="22"/>
+        </w:rPr>
+        <w:t xml:space="preserve">• /dashboard — home</w:t>
+      </w:r>
+    </w:p>
+    <w:p>
+      <w:pPr>
+        <w:spacing w:after="70"/>
+        <w:ind w:left="280"/>
+      </w:pPr>
+      <w:r>
+        <w:rPr>
+          <w:sz w:val="22"/>
+          <w:szCs w:val="22"/>
+        </w:rPr>
+        <w:t xml:space="preserve">• /profile — profile</w:t>
+      </w:r>
+    </w:p>
+    <w:p>
+      <w:pPr>
+        <w:spacing w:after="70"/>
+        <w:ind w:left="280"/>
+      </w:pPr>
+      <w:r>
+        <w:rPr>
+          <w:sz w:val="22"/>
+          <w:szCs w:val="22"/>
+        </w:rPr>
+        <w:t xml:space="preserve">• /notifications — notifications</w:t>
+      </w:r>
+    </w:p>
+    <w:p>
+      <w:pPr>
+        <w:spacing w:after="70"/>
+        <w:ind w:left="280"/>
+      </w:pPr>
+      <w:r>
+        <w:rPr>
+          <w:sz w:val="22"/>
+          <w:szCs w:val="22"/>
+        </w:rPr>
+        <w:t xml:space="preserve">• /policies — institutional policies</w:t>
+      </w:r>
+    </w:p>
+    <w:p>
+      <w:pPr>
+        <w:spacing w:after="90" w:before="180"/>
+      </w:pPr>
+      <w:r>
+        <w:rPr>
+          <w:b/>
+          <w:bCs/>
+          <w:color w:val="0369A1"/>
+          <w:sz w:val="24"/>
+          <w:szCs w:val="24"/>
+        </w:rPr>
+        <w:t xml:space="preserve">5.2 Research / proposals / projects</w:t>
+      </w:r>
+    </w:p>
+    <w:p>
+      <w:pPr>
+        <w:spacing w:after="70"/>
+        <w:ind w:left="280"/>
+      </w:pPr>
+      <w:r>
+        <w:rPr>
+          <w:sz w:val="22"/>
+          <w:szCs w:val="22"/>
+        </w:rPr>
+        <w:t xml:space="preserve">• /proposals — list; /proposals/new|edit — researcher create/edit</w:t>
+      </w:r>
+    </w:p>
+    <w:p>
+      <w:pPr>
+        <w:spacing w:after="70"/>
+        <w:ind w:left="280"/>
+      </w:pPr>
+      <w:r>
+        <w:rPr>
+          <w:sz w:val="22"/>
+          <w:szCs w:val="22"/>
+        </w:rPr>
+        <w:t xml:space="preserve">• /proposals/:id — details; /proposals/:id/review — Director/Coordinator/Leadership review</w:t>
+      </w:r>
+    </w:p>
+    <w:p>
+      <w:pPr>
+        <w:spacing w:after="70"/>
+        <w:ind w:left="280"/>
+      </w:pPr>
+      <w:r>
+        <w:rPr>
+          <w:sz w:val="22"/>
+          <w:szCs w:val="22"/>
+        </w:rPr>
+        <w:t xml:space="preserve">• /review-assignments — Director + Leadership peer queue</w:t>
+      </w:r>
+    </w:p>
+    <w:p>
+      <w:pPr>
+        <w:spacing w:after="70"/>
+        <w:ind w:left="280"/>
+      </w:pPr>
+      <w:r>
+        <w:rPr>
+          <w:sz w:val="22"/>
+          <w:szCs w:val="22"/>
+        </w:rPr>
+        <w:t xml:space="preserve">• /ethics — ethics applications + JUREC</w:t>
+      </w:r>
+    </w:p>
+    <w:p>
+      <w:pPr>
+        <w:spacing w:after="70"/>
+        <w:ind w:left="280"/>
+      </w:pPr>
+      <w:r>
+        <w:rPr>
+          <w:sz w:val="22"/>
+          <w:szCs w:val="22"/>
+        </w:rPr>
+        <w:t xml:space="preserve">• /projects — list; /projects/:id — details; /projects/:id/progress — researcher progress</w:t>
+      </w:r>
+    </w:p>
+    <w:p>
+      <w:pPr>
+        <w:spacing w:after="70"/>
+        <w:ind w:left="280"/>
+      </w:pPr>
+      <w:r>
+        <w:rPr>
+          <w:sz w:val="22"/>
+          <w:szCs w:val="22"/>
+        </w:rPr>
+        <w:t xml:space="preserve">• /publications, /repository, /groups, /thesis, /research-workflow</w:t>
+      </w:r>
+    </w:p>
+    <w:p>
+      <w:pPr>
+        <w:spacing w:after="70"/>
+        <w:ind w:left="280"/>
+      </w:pPr>
+      <w:r>
+        <w:rPr>
+          <w:sz w:val="22"/>
+          <w:szCs w:val="22"/>
+        </w:rPr>
+        <w:t xml:space="preserve">• /collaboration, /messages</w:t>
+      </w:r>
+    </w:p>
+    <w:p>
+      <w:pPr>
+        <w:spacing w:after="90" w:before="180"/>
+      </w:pPr>
+      <w:r>
+        <w:rPr>
+          <w:b/>
+          <w:bCs/>
+          <w:color w:val="0369A1"/>
+          <w:sz w:val="24"/>
+          <w:szCs w:val="24"/>
+        </w:rPr>
+        <w:t xml:space="preserve">5.3 Funding &amp; finance</w:t>
+      </w:r>
+    </w:p>
+    <w:p>
+      <w:pPr>
+        <w:spacing w:after="70"/>
+        <w:ind w:left="280"/>
+      </w:pPr>
+      <w:r>
+        <w:rPr>
+          <w:sz w:val="22"/>
+          <w:szCs w:val="22"/>
+        </w:rPr>
+        <w:t xml:space="preserve">• /funding-calls, /grants, /grants/apply, /grants/:id</w:t>
+      </w:r>
+    </w:p>
+    <w:p>
+      <w:pPr>
+        <w:spacing w:after="70"/>
+        <w:ind w:left="280"/>
+      </w:pPr>
+      <w:r>
+        <w:rPr>
+          <w:sz w:val="22"/>
+          <w:szCs w:val="22"/>
+        </w:rPr>
+        <w:t xml:space="preserve">• /budgets, /payments/:id</w:t>
+      </w:r>
+    </w:p>
+    <w:p>
+      <w:pPr>
+        <w:spacing w:after="70"/>
+        <w:ind w:left="280"/>
+      </w:pPr>
+      <w:r>
+        <w:rPr>
+          <w:sz w:val="22"/>
+          <w:szCs w:val="22"/>
+        </w:rPr>
+        <w:t xml:space="preserve">• /finance/reviews, /finance/reviews/:id — Finance proposal review</w:t>
+      </w:r>
+    </w:p>
+    <w:p>
+      <w:pPr>
+        <w:spacing w:after="70"/>
+        <w:ind w:left="280"/>
+      </w:pPr>
+      <w:r>
+        <w:rPr>
+          <w:sz w:val="22"/>
+          <w:szCs w:val="22"/>
+        </w:rPr>
+        <w:t xml:space="preserve">• /finance/grant-approvals — Finance grant authorization</w:t>
+      </w:r>
+    </w:p>
+    <w:p>
+      <w:pPr>
+        <w:spacing w:after="70"/>
+        <w:ind w:left="280"/>
+      </w:pPr>
+      <w:r>
+        <w:rPr>
+          <w:sz w:val="22"/>
+          <w:szCs w:val="22"/>
+        </w:rPr>
+        <w:t xml:space="preserve">• /finance/closures — Finance project closures</w:t>
+      </w:r>
+    </w:p>
+    <w:p>
+      <w:pPr>
+        <w:spacing w:after="70"/>
+        <w:ind w:left="280"/>
+      </w:pPr>
+      <w:r>
+        <w:rPr>
+          <w:sz w:val="22"/>
+          <w:szCs w:val="22"/>
+        </w:rPr>
+        <w:t xml:space="preserve">• /finance-reports, /donor-reports — Director/Finance reports</w:t>
+      </w:r>
+    </w:p>
+    <w:p>
+      <w:pPr>
+        <w:spacing w:after="90" w:before="180"/>
+      </w:pPr>
+      <w:r>
+        <w:rPr>
+          <w:b/>
+          <w:bCs/>
+          <w:color w:val="0369A1"/>
+          <w:sz w:val="24"/>
+          <w:szCs w:val="24"/>
+        </w:rPr>
+        <w:t xml:space="preserve">5.4 Director / staff ops</w:t>
+      </w:r>
+    </w:p>
+    <w:p>
+      <w:pPr>
+        <w:spacing w:after="70"/>
+        <w:ind w:left="280"/>
+      </w:pPr>
+      <w:r>
+        <w:rPr>
+          <w:sz w:val="22"/>
+          <w:szCs w:val="22"/>
+        </w:rPr>
+        <w:t xml:space="preserve">• /pending-users, /departments — Director</w:t>
+      </w:r>
+    </w:p>
+    <w:p>
+      <w:pPr>
+        <w:spacing w:after="70"/>
+        <w:ind w:left="280"/>
+      </w:pPr>
+      <w:r>
+        <w:rPr>
+          <w:sz w:val="22"/>
+          <w:szCs w:val="22"/>
+        </w:rPr>
+        <w:t xml:space="preserve">• /faculty-dashboard — Coordinator</w:t>
+      </w:r>
+    </w:p>
+    <w:p>
+      <w:pPr>
+        <w:spacing w:after="70"/>
+        <w:ind w:left="280"/>
+      </w:pPr>
+      <w:r>
+        <w:rPr>
+          <w:sz w:val="22"/>
+          <w:szCs w:val="22"/>
+        </w:rPr>
+        <w:t xml:space="preserve">• /kpi-dashboard, /system-reports, /audit-trail, /search</w:t>
+      </w:r>
+    </w:p>
+    <w:p>
+      <w:pPr>
+        <w:spacing w:after="70"/>
+        <w:ind w:left="280"/>
+      </w:pPr>
+      <w:r>
+        <w:rPr>
+          <w:sz w:val="22"/>
+          <w:szCs w:val="22"/>
+        </w:rPr>
+        <w:t xml:space="preserve">• /program-tier — portal picker for shared staff</w:t>
+      </w:r>
+    </w:p>
+    <w:p>
+      <w:pPr>
+        <w:spacing w:after="120" w:before="280"/>
       </w:pPr>
       <w:r>
         <w:rPr>
@@ -379,20 +954,72 @@
           <w:sz w:val="26"/>
           <w:szCs w:val="26"/>
         </w:rPr>
-        <w:t xml:space="preserve">5. API modules mounted in app.js (current)</w:t>
-      </w:r>
-    </w:p>
-    <w:p>
-      <w:pPr>
-        <w:spacing w:after="70"/>
-        <w:ind w:left="280"/>
-      </w:pPr>
-      <w:r>
-        <w:rPr>
-          <w:sz w:val="22"/>
-          <w:szCs w:val="22"/>
-        </w:rPr>
-        <w:t xml:space="preserve">• /api/auth, /api/users, /api/proposals, /api/ethics, /api/projects</w:t>
+        <w:t xml:space="preserve">6. Complete API surface (app.js)</w:t>
+      </w:r>
+    </w:p>
+    <w:p>
+      <w:pPr>
+        <w:spacing w:after="70"/>
+        <w:ind w:left="280"/>
+      </w:pPr>
+      <w:r>
+        <w:rPr>
+          <w:sz w:val="22"/>
+          <w:szCs w:val="22"/>
+        </w:rPr>
+        <w:t xml:space="preserve">• /api/auth — login, refresh, me</w:t>
+      </w:r>
+    </w:p>
+    <w:p>
+      <w:pPr>
+        <w:spacing w:after="70"/>
+        <w:ind w:left="280"/>
+      </w:pPr>
+      <w:r>
+        <w:rPr>
+          <w:sz w:val="22"/>
+          <w:szCs w:val="22"/>
+        </w:rPr>
+        <w:t xml:space="preserve">• /api/users — user admin / pending</w:t>
+      </w:r>
+    </w:p>
+    <w:p>
+      <w:pPr>
+        <w:spacing w:after="70"/>
+        <w:ind w:left="280"/>
+      </w:pPr>
+      <w:r>
+        <w:rPr>
+          <w:sz w:val="22"/>
+          <w:szCs w:val="22"/>
+        </w:rPr>
+        <w:t xml:space="preserve">• /api/proposals — CRUD, submit, assign-reviewers, assign-committee, assign-finance, peer/committee/finance review, director decision</w:t>
+      </w:r>
+    </w:p>
+    <w:p>
+      <w:pPr>
+        <w:spacing w:after="70"/>
+        <w:ind w:left="280"/>
+      </w:pPr>
+      <w:r>
+        <w:rPr>
+          <w:sz w:val="22"/>
+          <w:szCs w:val="22"/>
+        </w:rPr>
+        <w:t xml:space="preserve">• /api/ethics — applications, director decision, certificate PDF</w:t>
+      </w:r>
+    </w:p>
+    <w:p>
+      <w:pPr>
+        <w:spacing w:after="70"/>
+        <w:ind w:left="280"/>
+      </w:pPr>
+      <w:r>
+        <w:rPr>
+          <w:sz w:val="22"/>
+          <w:szCs w:val="22"/>
+        </w:rPr>
+        <w:t xml:space="preserve">• /api/projects — projects, progress, closure</w:t>
       </w:r>
     </w:p>
     <w:p>
@@ -418,20 +1045,33 @@
           <w:sz w:val="22"/>
           <w:szCs w:val="22"/>
         </w:rPr>
-        <w:t xml:space="preserve">• /api/publications, /api/repository, /api/groups, /api/thesis-groups</w:t>
-      </w:r>
-    </w:p>
-    <w:p>
-      <w:pPr>
-        <w:spacing w:after="70"/>
-        <w:ind w:left="280"/>
-      </w:pPr>
-      <w:r>
-        <w:rPr>
-          <w:sz w:val="22"/>
-          <w:szCs w:val="22"/>
-        </w:rPr>
-        <w:t xml:space="preserve">• /api/departments, /api/analytics, /api/notifications, /api/conversations</w:t>
+        <w:t xml:space="preserve">• /api/publications, /api/repository (+ public OAI-PMH)</w:t>
+      </w:r>
+    </w:p>
+    <w:p>
+      <w:pPr>
+        <w:spacing w:after="70"/>
+        <w:ind w:left="280"/>
+      </w:pPr>
+      <w:r>
+        <w:rPr>
+          <w:sz w:val="22"/>
+          <w:szCs w:val="22"/>
+        </w:rPr>
+        <w:t xml:space="preserve">• /api/groups, /api/thesis-groups, /api/departments</w:t>
+      </w:r>
+    </w:p>
+    <w:p>
+      <w:pPr>
+        <w:spacing w:after="70"/>
+        <w:ind w:left="280"/>
+      </w:pPr>
+      <w:r>
+        <w:rPr>
+          <w:sz w:val="22"/>
+          <w:szCs w:val="22"/>
+        </w:rPr>
+        <w:t xml:space="preserve">• /api/analytics, /api/notifications, /api/conversations</w:t>
       </w:r>
     </w:p>
     <w:p>
@@ -449,7 +1089,20 @@
     </w:p>
     <w:p>
       <w:pPr>
-        <w:spacing w:after="120" w:before="260"/>
+        <w:spacing w:after="70"/>
+        <w:ind w:left="280"/>
+      </w:pPr>
+      <w:r>
+        <w:rPr>
+          <w:sz w:val="22"/>
+          <w:szCs w:val="22"/>
+        </w:rPr>
+        <w:t xml:space="preserve">• /api/health — health check</w:t>
+      </w:r>
+    </w:p>
+    <w:p>
+      <w:pPr>
+        <w:spacing w:after="120" w:before="280"/>
       </w:pPr>
       <w:r>
         <w:rPr>
@@ -459,46 +1112,299 @@
           <w:sz w:val="26"/>
           <w:szCs w:val="26"/>
         </w:rPr>
-        <w:t xml:space="preserve">6. Local run</w:t>
-      </w:r>
-    </w:p>
-    <w:p>
-      <w:pPr>
-        <w:spacing w:after="70"/>
-        <w:ind w:left="280"/>
-      </w:pPr>
-      <w:r>
-        <w:rPr>
-          <w:sz w:val="22"/>
-          <w:szCs w:val="22"/>
-        </w:rPr>
-        <w:t xml:space="preserve">• Backend: cd backend &amp;&amp; npm run dev → http://localhost:5000</w:t>
-      </w:r>
-    </w:p>
-    <w:p>
-      <w:pPr>
-        <w:spacing w:after="70"/>
-        <w:ind w:left="280"/>
-      </w:pPr>
-      <w:r>
-        <w:rPr>
-          <w:sz w:val="22"/>
-          <w:szCs w:val="22"/>
-        </w:rPr>
-        <w:t xml:space="preserve">• Frontend: cd frontend &amp;&amp; npm run dev → http://localhost:5173</w:t>
-      </w:r>
-    </w:p>
-    <w:p>
-      <w:pPr>
-        <w:spacing w:after="70"/>
-        <w:ind w:left="280"/>
-      </w:pPr>
-      <w:r>
-        <w:rPr>
-          <w:sz w:val="22"/>
-          <w:szCs w:val="22"/>
-        </w:rPr>
-        <w:t xml:space="preserve">• After login all roles land on /dashboard</w:t>
+        <w:t xml:space="preserve">7. Roles and responsibilities (complete)</w:t>
+      </w:r>
+    </w:p>
+    <w:p>
+      <w:pPr>
+        <w:spacing w:after="70"/>
+        <w:ind w:left="280"/>
+      </w:pPr>
+      <w:r>
+        <w:rPr>
+          <w:sz w:val="22"/>
+          <w:szCs w:val="22"/>
+        </w:rPr>
+        <w:t xml:space="preserve">• research_director — assign peer/committee/finance; ethics certificate; final approve; users; funding calls; oversight reports</w:t>
+      </w:r>
+    </w:p>
+    <w:p>
+      <w:pPr>
+        <w:spacing w:after="70"/>
+        <w:ind w:left="280"/>
+      </w:pPr>
+      <w:r>
+        <w:rPr>
+          <w:sz w:val="22"/>
+          <w:szCs w:val="22"/>
+        </w:rPr>
+        <w:t xml:space="preserve">• faculty_coordinator — committee review when assigned; faculty dashboard</w:t>
+      </w:r>
+    </w:p>
+    <w:p>
+      <w:pPr>
+        <w:spacing w:after="70"/>
+        <w:ind w:left="280"/>
+      </w:pPr>
+      <w:r>
+        <w:rPr>
+          <w:sz w:val="22"/>
+          <w:szCs w:val="22"/>
+        </w:rPr>
+        <w:t xml:space="preserve">• leadership — peer review when assigned; peer assignments queue</w:t>
+      </w:r>
+    </w:p>
+    <w:p>
+      <w:pPr>
+        <w:spacing w:after="70"/>
+        <w:ind w:left="280"/>
+      </w:pPr>
+      <w:r>
+        <w:rPr>
+          <w:sz w:val="22"/>
+          <w:szCs w:val="22"/>
+        </w:rPr>
+        <w:t xml:space="preserve">• finance_officer — grant proposal finance review; grant authorization; budgets/payments; project closure finance</w:t>
+      </w:r>
+    </w:p>
+    <w:p>
+      <w:pPr>
+        <w:spacing w:after="70"/>
+        <w:ind w:left="280"/>
+      </w:pPr>
+      <w:r>
+        <w:rPr>
+          <w:sz w:val="22"/>
+          <w:szCs w:val="22"/>
+        </w:rPr>
+        <w:t xml:space="preserve">• researcher — proposals, ethics, projects, publications, grants apply, repository</w:t>
+      </w:r>
+    </w:p>
+    <w:p>
+      <w:pPr>
+        <w:spacing w:after="120" w:before="280"/>
+      </w:pPr>
+      <w:r>
+        <w:rPr>
+          <w:b/>
+          <w:bCs/>
+          <w:color w:val="0C4A6E"/>
+          <w:sz w:val="26"/>
+          <w:szCs w:val="26"/>
+        </w:rPr>
+        <w:t xml:space="preserve">Demo users and passwords (after npm run seed)</w:t>
+      </w:r>
+    </w:p>
+    <w:p>
+      <w:pPr>
+        <w:spacing w:after="70"/>
+        <w:ind w:left="280"/>
+      </w:pPr>
+      <w:r>
+        <w:rPr>
+          <w:sz w:val="22"/>
+          <w:szCs w:val="22"/>
+        </w:rPr>
+        <w:t xml:space="preserve">• Research Director — director@rms.edu / Director2024! — pick UG or PG</w:t>
+      </w:r>
+    </w:p>
+    <w:p>
+      <w:pPr>
+        <w:spacing w:after="70"/>
+        <w:ind w:left="280"/>
+      </w:pPr>
+      <w:r>
+        <w:rPr>
+          <w:sz w:val="22"/>
+          <w:szCs w:val="22"/>
+        </w:rPr>
+        <w:t xml:space="preserve">• Faculty Coordinator — coordinator@rms.edu / Coordinator2024! — pick UG or PG</w:t>
+      </w:r>
+    </w:p>
+    <w:p>
+      <w:pPr>
+        <w:spacing w:after="70"/>
+        <w:ind w:left="280"/>
+      </w:pPr>
+      <w:r>
+        <w:rPr>
+          <w:sz w:val="22"/>
+          <w:szCs w:val="22"/>
+        </w:rPr>
+        <w:t xml:space="preserve">• Finance Officer — finance@rms.edu / Finance2024! — pick UG or PG</w:t>
+      </w:r>
+    </w:p>
+    <w:p>
+      <w:pPr>
+        <w:spacing w:after="70"/>
+        <w:ind w:left="280"/>
+      </w:pPr>
+      <w:r>
+        <w:rPr>
+          <w:sz w:val="22"/>
+          <w:szCs w:val="22"/>
+        </w:rPr>
+        <w:t xml:space="preserve">• Leadership (peer) — leadership@rms.edu / Leadership2024! — pick UG or PG</w:t>
+      </w:r>
+    </w:p>
+    <w:p>
+      <w:pPr>
+        <w:spacing w:after="70"/>
+        <w:ind w:left="280"/>
+      </w:pPr>
+      <w:r>
+        <w:rPr>
+          <w:sz w:val="22"/>
+          <w:szCs w:val="22"/>
+        </w:rPr>
+        <w:t xml:space="preserve">• Researcher UG — asha@rms.edu / Researcher2024! — Undergraduate only</w:t>
+      </w:r>
+    </w:p>
+    <w:p>
+      <w:pPr>
+        <w:spacing w:after="70"/>
+        <w:ind w:left="280"/>
+      </w:pPr>
+      <w:r>
+        <w:rPr>
+          <w:sz w:val="22"/>
+          <w:szCs w:val="22"/>
+        </w:rPr>
+        <w:t xml:space="preserve">• Researcher PG — mahad@rms.edu / Researcher2024! — Postgraduate only</w:t>
+      </w:r>
+    </w:p>
+    <w:p>
+      <w:pPr>
+        <w:spacing w:after="120" w:before="280"/>
+      </w:pPr>
+      <w:r>
+        <w:rPr>
+          <w:b/>
+          <w:bCs/>
+          <w:color w:val="0C4A6E"/>
+          <w:sz w:val="26"/>
+          <w:szCs w:val="26"/>
+        </w:rPr>
+        <w:t xml:space="preserve">8. Security and scoping</w:t>
+      </w:r>
+    </w:p>
+    <w:p>
+      <w:pPr>
+        <w:spacing w:after="70"/>
+        <w:ind w:left="280"/>
+      </w:pPr>
+      <w:r>
+        <w:rPr>
+          <w:sz w:val="22"/>
+          <w:szCs w:val="22"/>
+        </w:rPr>
+        <w:t xml:space="preserve">• JWT Bearer required on protected routes</w:t>
+      </w:r>
+    </w:p>
+    <w:p>
+      <w:pPr>
+        <w:spacing w:after="70"/>
+        <w:ind w:left="280"/>
+      </w:pPr>
+      <w:r>
+        <w:rPr>
+          <w:sz w:val="22"/>
+          <w:szCs w:val="22"/>
+        </w:rPr>
+        <w:t xml:space="preserve">• authorizeRoles on sensitive endpoints (peer/committee/finance assign &amp; decide)</w:t>
+      </w:r>
+    </w:p>
+    <w:p>
+      <w:pPr>
+        <w:spacing w:after="70"/>
+        <w:ind w:left="280"/>
+      </w:pPr>
+      <w:r>
+        <w:rPr>
+          <w:sz w:val="22"/>
+          <w:szCs w:val="22"/>
+        </w:rPr>
+        <w:t xml:space="preserve">• programTier filter on business documents</w:t>
+      </w:r>
+    </w:p>
+    <w:p>
+      <w:pPr>
+        <w:spacing w:after="70"/>
+        <w:ind w:left="280"/>
+      </w:pPr>
+      <w:r>
+        <w:rPr>
+          <w:sz w:val="22"/>
+          <w:szCs w:val="22"/>
+        </w:rPr>
+        <w:t xml:space="preserve">• Assign-first gates: committee/finance cannot decide without assignment</w:t>
+      </w:r>
+    </w:p>
+    <w:p>
+      <w:pPr>
+        <w:spacing w:after="70"/>
+        <w:ind w:left="280"/>
+      </w:pPr>
+      <w:r>
+        <w:rPr>
+          <w:sz w:val="22"/>
+          <w:szCs w:val="22"/>
+        </w:rPr>
+        <w:t xml:space="preserve">• Director final approve blocked until multi-stage ready_for_director</w:t>
+      </w:r>
+    </w:p>
+    <w:p>
+      <w:pPr>
+        <w:spacing w:after="120" w:before="280"/>
+      </w:pPr>
+      <w:r>
+        <w:rPr>
+          <w:b/>
+          <w:bCs/>
+          <w:color w:val="0C4A6E"/>
+          <w:sz w:val="26"/>
+          <w:szCs w:val="26"/>
+        </w:rPr>
+        <w:t xml:space="preserve">9. Run and deploy</w:t>
+      </w:r>
+    </w:p>
+    <w:p>
+      <w:pPr>
+        <w:spacing w:after="70"/>
+        <w:ind w:left="280"/>
+      </w:pPr>
+      <w:r>
+        <w:rPr>
+          <w:sz w:val="22"/>
+          <w:szCs w:val="22"/>
+        </w:rPr>
+        <w:t xml:space="preserve">• Local: backend npm run dev + frontend npm run dev; seed with npm run seed</w:t>
+      </w:r>
+    </w:p>
+    <w:p>
+      <w:pPr>
+        <w:spacing w:after="70"/>
+        <w:ind w:left="280"/>
+      </w:pPr>
+      <w:r>
+        <w:rPr>
+          <w:sz w:val="22"/>
+          <w:szCs w:val="22"/>
+        </w:rPr>
+        <w:t xml:space="preserve">• Production option: Render Blueprint (render.yaml) + MongoDB Atlas</w:t>
+      </w:r>
+    </w:p>
+    <w:p>
+      <w:pPr>
+        <w:spacing w:after="70"/>
+        <w:ind w:left="280"/>
+      </w:pPr>
+      <w:r>
+        <w:rPr>
+          <w:sz w:val="22"/>
+          <w:szCs w:val="22"/>
+        </w:rPr>
+        <w:t xml:space="preserve">• Related Word: DATABASE_STRUCTURE.docx (full schema), SYSTEM_HOW_IT_WORKS.docx (user guide)</w:t>
       </w:r>
     </w:p>
     <w:sectPr>

</xml_diff>